<commit_message>
V1.19.19 correção de bugs finais
</commit_message>
<xml_diff>
--- a/codigo/word_templates/proposta_tecnica_template.docx
+++ b/codigo/word_templates/proposta_tecnica_template.docx
@@ -104,6 +104,7 @@
             <w:docPartGallery w:val="Watermarks"/>
           </w:docPartObj>
         </w:sdtPr>
+        <w:sdtEndPr/>
         <w:sdtContent>
           <w:r>
             <w:rPr>
@@ -112,7 +113,7 @@
               <w:color w:val="auto"/>
             </w:rPr>
             <w:drawing>
-              <wp:anchor distT="0" distB="0" distL="114300" distR="114300" simplePos="0" relativeHeight="251659264" behindDoc="1" locked="0" layoutInCell="0" allowOverlap="1" wp14:anchorId="09D026D2" wp14:editId="19CF1CFA">
+              <wp:anchor distT="0" distB="0" distL="114300" distR="114300" simplePos="0" relativeHeight="251659264" behindDoc="1" locked="0" layoutInCell="0" allowOverlap="1" wp14:anchorId="09D026D2" wp14:editId="0D1C0FEB">
                 <wp:simplePos x="0" y="0"/>
                 <wp:positionH relativeFrom="margin">
                   <wp:align>center</wp:align>
@@ -3978,6 +3979,7 @@
             <w14:uncheckedState w14:val="2610" w14:font="MS Gothic"/>
           </w14:checkbox>
         </w:sdtPr>
+        <w:sdtEndPr/>
         <w:sdtContent>
           <w:r>
             <w:rPr>
@@ -4014,6 +4016,7 @@
             <w14:uncheckedState w14:val="2610" w14:font="MS Gothic"/>
           </w14:checkbox>
         </w:sdtPr>
+        <w:sdtEndPr/>
         <w:sdtContent>
           <w:r>
             <w:rPr>
@@ -4478,6 +4481,7 @@
             <w14:uncheckedState w14:val="2610" w14:font="MS Gothic"/>
           </w14:checkbox>
         </w:sdtPr>
+        <w:sdtEndPr/>
         <w:sdtContent>
           <w:r>
             <w:rPr>
@@ -4514,6 +4518,7 @@
             <w14:uncheckedState w14:val="2610" w14:font="MS Gothic"/>
           </w14:checkbox>
         </w:sdtPr>
+        <w:sdtEndPr/>
         <w:sdtContent>
           <w:r>
             <w:rPr>
@@ -5140,6 +5145,7 @@
             <w14:uncheckedState w14:val="2610" w14:font="MS Gothic"/>
           </w14:checkbox>
         </w:sdtPr>
+        <w:sdtEndPr/>
         <w:sdtContent>
           <w:r>
             <w:rPr>
@@ -5177,6 +5183,7 @@
             <w14:uncheckedState w14:val="2610" w14:font="MS Gothic"/>
           </w14:checkbox>
         </w:sdtPr>
+        <w:sdtEndPr/>
         <w:sdtContent>
           <w:r>
             <w:rPr>
@@ -5214,6 +5221,7 @@
             <w14:uncheckedState w14:val="2610" w14:font="MS Gothic"/>
           </w14:checkbox>
         </w:sdtPr>
+        <w:sdtEndPr/>
         <w:sdtContent>
           <w:r>
             <w:rPr>
@@ -5251,6 +5259,7 @@
             <w14:uncheckedState w14:val="2610" w14:font="MS Gothic"/>
           </w14:checkbox>
         </w:sdtPr>
+        <w:sdtEndPr/>
         <w:sdtContent>
           <w:r>
             <w:rPr>
@@ -5288,6 +5297,7 @@
             <w14:uncheckedState w14:val="2610" w14:font="MS Gothic"/>
           </w14:checkbox>
         </w:sdtPr>
+        <w:sdtEndPr/>
         <w:sdtContent>
           <w:r>
             <w:rPr>
@@ -5325,6 +5335,7 @@
             <w14:uncheckedState w14:val="2610" w14:font="MS Gothic"/>
           </w14:checkbox>
         </w:sdtPr>
+        <w:sdtEndPr/>
         <w:sdtContent>
           <w:r>
             <w:rPr>
@@ -5380,6 +5391,7 @@
             <w14:uncheckedState w14:val="2610" w14:font="MS Gothic"/>
           </w14:checkbox>
         </w:sdtPr>
+        <w:sdtEndPr/>
         <w:sdtContent>
           <w:r>
             <w:rPr>
@@ -5415,6 +5427,7 @@
             <w14:uncheckedState w14:val="2610" w14:font="MS Gothic"/>
           </w14:checkbox>
         </w:sdtPr>
+        <w:sdtEndPr/>
         <w:sdtContent>
           <w:r>
             <w:rPr>
@@ -6113,6 +6126,7 @@
             <w14:uncheckedState w14:val="2610" w14:font="MS Gothic"/>
           </w14:checkbox>
         </w:sdtPr>
+        <w:sdtEndPr/>
         <w:sdtContent>
           <w:r>
             <w:rPr>
@@ -6148,6 +6162,7 @@
             <w14:uncheckedState w14:val="2610" w14:font="MS Gothic"/>
           </w14:checkbox>
         </w:sdtPr>
+        <w:sdtEndPr/>
         <w:sdtContent>
           <w:r>
             <w:rPr>
@@ -7241,6 +7256,7 @@
             <w14:uncheckedState w14:val="2610" w14:font="MS Gothic"/>
           </w14:checkbox>
         </w:sdtPr>
+        <w:sdtEndPr/>
         <w:sdtContent>
           <w:r>
             <w:rPr>
@@ -7276,6 +7292,7 @@
             <w14:uncheckedState w14:val="2610" w14:font="MS Gothic"/>
           </w14:checkbox>
         </w:sdtPr>
+        <w:sdtEndPr/>
         <w:sdtContent>
           <w:r>
             <w:rPr>
@@ -7941,6 +7958,7 @@
             <w14:uncheckedState w14:val="2610" w14:font="MS Gothic"/>
           </w14:checkbox>
         </w:sdtPr>
+        <w:sdtEndPr/>
         <w:sdtContent>
           <w:r>
             <w:rPr>
@@ -7976,6 +7994,7 @@
             <w14:uncheckedState w14:val="2610" w14:font="MS Gothic"/>
           </w14:checkbox>
         </w:sdtPr>
+        <w:sdtEndPr/>
         <w:sdtContent>
           <w:r>
             <w:rPr>
@@ -8640,6 +8659,7 @@
             <w14:uncheckedState w14:val="2610" w14:font="MS Gothic"/>
           </w14:checkbox>
         </w:sdtPr>
+        <w:sdtEndPr/>
         <w:sdtContent>
           <w:r>
             <w:rPr>
@@ -8675,6 +8695,7 @@
             <w14:uncheckedState w14:val="2610" w14:font="MS Gothic"/>
           </w14:checkbox>
         </w:sdtPr>
+        <w:sdtEndPr/>
         <w:sdtContent>
           <w:r>
             <w:rPr>
@@ -9552,6 +9573,7 @@
             <w14:uncheckedState w14:val="2610" w14:font="MS Gothic"/>
           </w14:checkbox>
         </w:sdtPr>
+        <w:sdtEndPr/>
         <w:sdtContent>
           <w:r>
             <w:rPr>
@@ -9587,6 +9609,7 @@
             <w14:uncheckedState w14:val="2610" w14:font="MS Gothic"/>
           </w14:checkbox>
         </w:sdtPr>
+        <w:sdtEndPr/>
         <w:sdtContent>
           <w:r>
             <w:rPr>
@@ -10501,6 +10524,7 @@
             <w14:uncheckedState w14:val="2610" w14:font="MS Gothic"/>
           </w14:checkbox>
         </w:sdtPr>
+        <w:sdtEndPr/>
         <w:sdtContent>
           <w:r>
             <w:rPr>
@@ -10536,6 +10560,7 @@
             <w14:uncheckedState w14:val="2610" w14:font="MS Gothic"/>
           </w14:checkbox>
         </w:sdtPr>
+        <w:sdtEndPr/>
         <w:sdtContent>
           <w:r>
             <w:rPr>
@@ -11237,6 +11262,7 @@
             <w14:uncheckedState w14:val="2610" w14:font="MS Gothic"/>
           </w14:checkbox>
         </w:sdtPr>
+        <w:sdtEndPr/>
         <w:sdtContent>
           <w:r>
             <w:rPr>
@@ -11272,6 +11298,7 @@
             <w14:uncheckedState w14:val="2610" w14:font="MS Gothic"/>
           </w14:checkbox>
         </w:sdtPr>
+        <w:sdtEndPr/>
         <w:sdtContent>
           <w:r>
             <w:rPr>
@@ -11774,6 +11801,7 @@
             <w14:uncheckedState w14:val="2610" w14:font="MS Gothic"/>
           </w14:checkbox>
         </w:sdtPr>
+        <w:sdtEndPr/>
         <w:sdtContent>
           <w:r>
             <w:rPr>
@@ -11809,6 +11837,7 @@
             <w14:uncheckedState w14:val="2610" w14:font="MS Gothic"/>
           </w14:checkbox>
         </w:sdtPr>
+        <w:sdtEndPr/>
         <w:sdtContent>
           <w:r>
             <w:rPr>
@@ -12580,6 +12609,7 @@
             <w14:uncheckedState w14:val="2610" w14:font="MS Gothic"/>
           </w14:checkbox>
         </w:sdtPr>
+        <w:sdtEndPr/>
         <w:sdtContent>
           <w:r>
             <w:rPr>
@@ -12615,6 +12645,7 @@
             <w14:uncheckedState w14:val="2610" w14:font="MS Gothic"/>
           </w14:checkbox>
         </w:sdtPr>
+        <w:sdtEndPr/>
         <w:sdtContent>
           <w:r>
             <w:rPr>
@@ -12798,6 +12829,7 @@
             <w14:uncheckedState w14:val="2610" w14:font="MS Gothic"/>
           </w14:checkbox>
         </w:sdtPr>
+        <w:sdtEndPr/>
         <w:sdtContent>
           <w:r>
             <w:rPr>
@@ -12833,6 +12865,7 @@
             <w14:uncheckedState w14:val="2610" w14:font="MS Gothic"/>
           </w14:checkbox>
         </w:sdtPr>
+        <w:sdtEndPr/>
         <w:sdtContent>
           <w:r>
             <w:rPr>
@@ -13296,6 +13329,7 @@
             <w14:uncheckedState w14:val="2610" w14:font="MS Gothic"/>
           </w14:checkbox>
         </w:sdtPr>
+        <w:sdtEndPr/>
         <w:sdtContent>
           <w:r>
             <w:rPr>
@@ -13331,6 +13365,7 @@
             <w14:uncheckedState w14:val="2610" w14:font="MS Gothic"/>
           </w14:checkbox>
         </w:sdtPr>
+        <w:sdtEndPr/>
         <w:sdtContent>
           <w:r>
             <w:rPr>
@@ -13520,6 +13555,7 @@
             <w14:uncheckedState w14:val="2610" w14:font="MS Gothic"/>
           </w14:checkbox>
         </w:sdtPr>
+        <w:sdtEndPr/>
         <w:sdtContent>
           <w:r>
             <w:rPr>
@@ -13555,6 +13591,7 @@
             <w14:uncheckedState w14:val="2610" w14:font="MS Gothic"/>
           </w14:checkbox>
         </w:sdtPr>
+        <w:sdtEndPr/>
         <w:sdtContent>
           <w:r>
             <w:rPr>
@@ -13992,6 +14029,7 @@
             <w14:uncheckedState w14:val="2610" w14:font="MS Gothic"/>
           </w14:checkbox>
         </w:sdtPr>
+        <w:sdtEndPr/>
         <w:sdtContent>
           <w:r>
             <w:rPr>
@@ -14027,6 +14065,7 @@
             <w14:uncheckedState w14:val="2610" w14:font="MS Gothic"/>
           </w14:checkbox>
         </w:sdtPr>
+        <w:sdtEndPr/>
         <w:sdtContent>
           <w:r>
             <w:rPr>
@@ -14217,6 +14256,7 @@
             <w14:uncheckedState w14:val="2610" w14:font="MS Gothic"/>
           </w14:checkbox>
         </w:sdtPr>
+        <w:sdtEndPr/>
         <w:sdtContent>
           <w:r>
             <w:rPr>
@@ -14252,6 +14292,7 @@
             <w14:uncheckedState w14:val="2610" w14:font="MS Gothic"/>
           </w14:checkbox>
         </w:sdtPr>
+        <w:sdtEndPr/>
         <w:sdtContent>
           <w:r>
             <w:rPr>
@@ -14641,6 +14682,7 @@
             <w14:uncheckedState w14:val="2610" w14:font="MS Gothic"/>
           </w14:checkbox>
         </w:sdtPr>
+        <w:sdtEndPr/>
         <w:sdtContent>
           <w:r>
             <w:rPr>
@@ -14676,6 +14718,7 @@
             <w14:uncheckedState w14:val="2610" w14:font="MS Gothic"/>
           </w14:checkbox>
         </w:sdtPr>
+        <w:sdtEndPr/>
         <w:sdtContent>
           <w:r>
             <w:rPr>
@@ -14878,6 +14921,7 @@
             <w14:uncheckedState w14:val="2610" w14:font="MS Gothic"/>
           </w14:checkbox>
         </w:sdtPr>
+        <w:sdtEndPr/>
         <w:sdtContent>
           <w:r>
             <w:rPr>
@@ -14913,6 +14957,7 @@
             <w14:uncheckedState w14:val="2610" w14:font="MS Gothic"/>
           </w14:checkbox>
         </w:sdtPr>
+        <w:sdtEndPr/>
         <w:sdtContent>
           <w:r>
             <w:rPr>
@@ -15304,6 +15349,7 @@
             <w14:uncheckedState w14:val="2610" w14:font="MS Gothic"/>
           </w14:checkbox>
         </w:sdtPr>
+        <w:sdtEndPr/>
         <w:sdtContent>
           <w:r>
             <w:rPr>
@@ -15339,6 +15385,7 @@
             <w14:uncheckedState w14:val="2610" w14:font="MS Gothic"/>
           </w14:checkbox>
         </w:sdtPr>
+        <w:sdtEndPr/>
         <w:sdtContent>
           <w:r>
             <w:rPr>
@@ -15502,27 +15549,8 @@
         <w:rPr>
           <w:color w:val="auto"/>
         </w:rPr>
-        <w:t xml:space="preserve">{% endfor </w:t>
-      </w:r>
-      <w:r>
-        <w:rPr>
-          <w:color w:val="auto"/>
-        </w:rPr>
-        <w:t>-</w:t>
-      </w:r>
-      <w:r>
-        <w:rPr>
-          <w:color w:val="auto"/>
-        </w:rPr>
-        <w:t>%}</w:t>
-      </w:r>
-    </w:p>
-    <w:p>
-      <w:pPr>
-        <w:rPr>
-          <w:color w:val="auto"/>
-        </w:rPr>
-      </w:pPr>
+        <w:t>{% endfor %}</w:t>
+      </w:r>
     </w:p>
     <w:p>
       <w:pPr>
@@ -15555,6 +15583,7 @@
             <w14:uncheckedState w14:val="2610" w14:font="MS Gothic"/>
           </w14:checkbox>
         </w:sdtPr>
+        <w:sdtEndPr/>
         <w:sdtContent>
           <w:r>
             <w:rPr>
@@ -15590,6 +15619,7 @@
             <w14:uncheckedState w14:val="2610" w14:font="MS Gothic"/>
           </w14:checkbox>
         </w:sdtPr>
+        <w:sdtEndPr/>
         <w:sdtContent>
           <w:r>
             <w:rPr>
@@ -15617,15 +15647,2061 @@
         <w:rPr>
           <w:color w:val="auto"/>
         </w:rPr>
-        <w:t>{% endif %}</w:t>
+        <w:t xml:space="preserve">{% endif </w:t>
+      </w:r>
+      <w:r>
+        <w:rPr>
+          <w:color w:val="auto"/>
+        </w:rPr>
+        <w:t>-</w:t>
+      </w:r>
+      <w:r>
+        <w:rPr>
+          <w:color w:val="auto"/>
+        </w:rPr>
+        <w:t>%}</w:t>
+      </w:r>
+    </w:p>
+    <w:p>
+      <w:pPr>
+        <w:rPr>
+          <w:color w:val="auto"/>
+        </w:rPr>
+      </w:pPr>
+      <w:r>
+        <w:rPr>
+          <w:color w:val="auto"/>
+        </w:rPr>
+        <w:t>{% for projeto in projetos -%}</w:t>
+      </w:r>
+    </w:p>
+    <w:p>
+      <w:r>
+        <w:t>{% if projeto.tem_dutos %}</w:t>
+      </w:r>
+    </w:p>
+    <w:p>
+      <w:pPr>
+        <w:keepNext/>
+        <w:keepLines/>
+        <w:shd w:val="clear" w:color="auto" w:fill="F2F2F2"/>
+        <w:ind w:firstLine="0"/>
+        <w:outlineLvl w:val="0"/>
+        <w:rPr>
+          <w:b/>
+          <w:bCs/>
+          <w:lang w:eastAsia="x-none"/>
+        </w:rPr>
+      </w:pPr>
+      <w:r>
+        <w:rPr>
+          <w:b/>
+          <w:bCs/>
+          <w:lang w:eastAsia="x-none"/>
+        </w:rPr>
+        <w:t>{{ ns.section }}</w:t>
+      </w:r>
+      <w:r>
+        <w:rPr>
+          <w:b/>
+          <w:bCs/>
+          <w:lang w:eastAsia="x-none"/>
+        </w:rPr>
+        <w:t xml:space="preserve"> </w:t>
+      </w:r>
+      <w:r>
+        <w:rPr>
+          <w:b/>
+          <w:bCs/>
+          <w:lang w:val="x-none" w:eastAsia="x-none"/>
+        </w:rPr>
+        <w:t xml:space="preserve">– </w:t>
+      </w:r>
+      <w:r>
+        <w:rPr>
+          <w:b/>
+          <w:bCs/>
+          <w:lang w:eastAsia="x-none"/>
+        </w:rPr>
+        <w:t>DUTOS DE AR</w:t>
+      </w:r>
+    </w:p>
+    <w:p>
+      <w:pPr>
+        <w:ind w:firstLine="0"/>
+        <w:rPr>
+          <w:lang w:eastAsia="x-none"/>
+        </w:rPr>
+      </w:pPr>
+      <w:r>
+        <w:rPr>
+          <w:lang w:eastAsia="x-none"/>
+        </w:rPr>
+        <w:t>{% set ns.section = ns.section + 1 %}</w:t>
+      </w:r>
+    </w:p>
+    <w:p>
+      <w:pPr>
+        <w:keepNext/>
+        <w:keepLines/>
+        <w:outlineLvl w:val="1"/>
+        <w:rPr>
+          <w:b/>
+          <w:bCs/>
+          <w:lang w:eastAsia="x-none"/>
+        </w:rPr>
+      </w:pPr>
+      <w:r>
+        <w:rPr>
+          <w:b/>
+          <w:bCs/>
+          <w:lang w:eastAsia="x-none"/>
+        </w:rPr>
+        <w:t>{</w:t>
+      </w:r>
+      <w:r>
+        <w:rPr>
+          <w:b/>
+          <w:bCs/>
+          <w:lang w:eastAsia="x-none"/>
+        </w:rPr>
+        <w:t>{ ns.section-1 }}</w:t>
+      </w:r>
+      <w:r>
+        <w:rPr>
+          <w:b/>
+          <w:bCs/>
+          <w:lang w:val="x-none" w:eastAsia="x-none"/>
+        </w:rPr>
+        <w:t xml:space="preserve">.1 – </w:t>
+      </w:r>
+      <w:r>
+        <w:rPr>
+          <w:b/>
+          <w:bCs/>
+          <w:lang w:eastAsia="x-none"/>
+        </w:rPr>
+        <w:t>DUTOS DE CLIMATIZAÇÃO</w:t>
+      </w:r>
+    </w:p>
+    <w:p>
+      <w:pPr>
+        <w:tabs>
+          <w:tab w:val="clear" w:pos="0"/>
+          <w:tab w:val="left" w:pos="567"/>
+        </w:tabs>
+        <w:ind w:left="426" w:firstLine="0"/>
+        <w:rPr>
+          <w:lang w:eastAsia="x-none"/>
+        </w:rPr>
+      </w:pPr>
+      <w:r>
+        <w:rPr>
+          <w:lang w:eastAsia="x-none"/>
+        </w:rPr>
+        <w:t>Os dutos serão fabricados em chapa de aço galvanizado ou MPU, sem pintura, isolados termicamente em trechos não climatizados que encaminham somente ar frio. Para trechos isolados termicamente, serão utilizados isolantes autoextinguíveis classe I.</w:t>
+      </w:r>
+    </w:p>
+    <w:p>
+      <w:sdt>
+        <w:sdtPr>
+          <w:id w:val="1486828392"/>
+          <w14:checkbox>
+            <w14:checked w14:val="0"/>
+            <w14:checkedState w14:val="2612" w14:font="MS Gothic"/>
+            <w14:uncheckedState w14:val="2610" w14:font="MS Gothic"/>
+          </w14:checkbox>
+        </w:sdtPr>
+        <w:sdtEndPr/>
+        <w:sdtContent>
+          <w:r>
+            <w:rPr>
+              <w:rFonts w:ascii="Segoe UI Symbol" w:hAnsi="Segoe UI Symbol" w:cs="Segoe UI Symbol"/>
+            </w:rPr>
+            <w:t>☐</w:t>
+          </w:r>
+        </w:sdtContent>
+      </w:sdt>
+      <w:r>
+        <w:t xml:space="preserve"> Pintura</w:t>
+      </w:r>
+    </w:p>
+    <w:p>
+      <w:sdt>
+        <w:sdtPr>
+          <w:id w:val="1943417619"/>
+          <w14:checkbox>
+            <w14:checked w14:val="0"/>
+            <w14:checkedState w14:val="2612" w14:font="MS Gothic"/>
+            <w14:uncheckedState w14:val="2610" w14:font="MS Gothic"/>
+          </w14:checkbox>
+        </w:sdtPr>
+        <w:sdtEndPr/>
+        <w:sdtContent>
+          <w:r>
+            <w:rPr>
+              <w:rFonts w:ascii="Segoe UI Symbol" w:hAnsi="Segoe UI Symbol" w:cs="Segoe UI Symbol"/>
+            </w:rPr>
+            <w:t>☐</w:t>
+          </w:r>
+        </w:sdtContent>
+      </w:sdt>
+      <w:r>
+        <w:t xml:space="preserve"> Rechapeamento</w:t>
+      </w:r>
+    </w:p>
+    <w:p>
+      <w:sdt>
+        <w:sdtPr>
+          <w:id w:val="-1462484675"/>
+          <w14:checkbox>
+            <w14:checked w14:val="0"/>
+            <w14:checkedState w14:val="2612" w14:font="MS Gothic"/>
+            <w14:uncheckedState w14:val="2610" w14:font="MS Gothic"/>
+          </w14:checkbox>
+        </w:sdtPr>
+        <w:sdtEndPr/>
+        <w:sdtContent>
+          <w:r>
+            <w:rPr>
+              <w:rFonts w:ascii="Segoe UI Symbol" w:hAnsi="Segoe UI Symbol" w:cs="Segoe UI Symbol"/>
+            </w:rPr>
+            <w:t>☐</w:t>
+          </w:r>
+        </w:sdtContent>
+      </w:sdt>
+      <w:r>
+        <w:t xml:space="preserve"> Miscelâneas de montagem</w:t>
+      </w:r>
+    </w:p>
+    <w:p>
+      <w:sdt>
+        <w:sdtPr>
+          <w:id w:val="11500762"/>
+          <w14:checkbox>
+            <w14:checked w14:val="0"/>
+            <w14:checkedState w14:val="2612" w14:font="MS Gothic"/>
+            <w14:uncheckedState w14:val="2610" w14:font="MS Gothic"/>
+          </w14:checkbox>
+        </w:sdtPr>
+        <w:sdtEndPr/>
+        <w:sdtContent>
+          <w:r>
+            <w:rPr>
+              <w:rFonts w:ascii="Segoe UI Symbol" w:hAnsi="Segoe UI Symbol" w:cs="Segoe UI Symbol"/>
+            </w:rPr>
+            <w:t>☐</w:t>
+          </w:r>
+        </w:sdtContent>
+      </w:sdt>
+      <w:r>
+        <w:t xml:space="preserve"> Mão de obra de montagem</w:t>
+      </w:r>
+    </w:p>
+    <w:p/>
+    <w:p>
+      <w:r>
+        <w:t>Legenda:</w:t>
+      </w:r>
+    </w:p>
+    <w:p>
+      <w:sdt>
+        <w:sdtPr>
+          <w:id w:val="602079511"/>
+          <w14:checkbox>
+            <w14:checked w14:val="1"/>
+            <w14:checkedState w14:val="2612" w14:font="MS Gothic"/>
+            <w14:uncheckedState w14:val="2610" w14:font="MS Gothic"/>
+          </w14:checkbox>
+        </w:sdtPr>
+        <w:sdtEndPr/>
+        <w:sdtContent>
+          <w:r>
+            <w:rPr>
+              <w:rFonts w:ascii="Segoe UI Symbol" w:hAnsi="Segoe UI Symbol" w:cs="Segoe UI Symbol"/>
+            </w:rPr>
+            <w:t>☒</w:t>
+          </w:r>
+        </w:sdtContent>
+      </w:sdt>
+      <w:r>
+        <w:t xml:space="preserve"> Incluso</w:t>
+      </w:r>
+    </w:p>
+    <w:p>
+      <w:sdt>
+        <w:sdtPr>
+          <w:id w:val="199597201"/>
+          <w14:checkbox>
+            <w14:checked w14:val="0"/>
+            <w14:checkedState w14:val="2612" w14:font="MS Gothic"/>
+            <w14:uncheckedState w14:val="2610" w14:font="MS Gothic"/>
+          </w14:checkbox>
+        </w:sdtPr>
+        <w:sdtEndPr/>
+        <w:sdtContent>
+          <w:r>
+            <w:rPr>
+              <w:rFonts w:ascii="Segoe UI Symbol" w:hAnsi="Segoe UI Symbol" w:cs="Segoe UI Symbol"/>
+            </w:rPr>
+            <w:t>☐</w:t>
+          </w:r>
+        </w:sdtContent>
+      </w:sdt>
+      <w:r>
+        <w:t xml:space="preserve"> Não incluso</w:t>
+      </w:r>
+    </w:p>
+    <w:p>
+      <w:pPr>
+        <w:rPr>
+          <w:lang w:eastAsia="x-none"/>
+        </w:rPr>
+      </w:pPr>
+      <w:r>
+        <w:rPr>
+          <w:lang w:eastAsia="x-none"/>
+        </w:rPr>
+        <w:t xml:space="preserve">{% endif </w:t>
+      </w:r>
+      <w:r>
+        <w:rPr>
+          <w:lang w:eastAsia="x-none"/>
+        </w:rPr>
+        <w:t>-</w:t>
+      </w:r>
+      <w:r>
+        <w:rPr>
+          <w:lang w:eastAsia="x-none"/>
+        </w:rPr>
+        <w:t>%}</w:t>
+      </w:r>
+    </w:p>
+    <w:p>
+      <w:pPr>
+        <w:keepNext/>
+        <w:keepLines/>
+        <w:shd w:val="clear" w:color="auto" w:fill="F2F2F2"/>
+        <w:outlineLvl w:val="0"/>
+        <w:rPr>
+          <w:lang w:eastAsia="x-none"/>
+        </w:rPr>
+      </w:pPr>
+      <w:bookmarkStart w:id="47" w:name="_Toc527033863"/>
+      <w:r>
+        <w:rPr>
+          <w:lang w:eastAsia="x-none"/>
+        </w:rPr>
+        <w:t>{% if projeto.acessorios.lista and projeto.acessorios.lista|length &gt; 0 %}</w:t>
+      </w:r>
+    </w:p>
+    <w:p>
+      <w:pPr>
+        <w:keepNext/>
+        <w:keepLines/>
+        <w:shd w:val="clear" w:color="auto" w:fill="F2F2F2"/>
+        <w:ind w:firstLine="0"/>
+        <w:outlineLvl w:val="0"/>
+        <w:rPr>
+          <w:b/>
+          <w:bCs/>
+          <w:lang w:eastAsia="x-none"/>
+        </w:rPr>
+      </w:pPr>
+      <w:r>
+        <w:rPr>
+          <w:b/>
+          <w:bCs/>
+          <w:lang w:eastAsia="x-none"/>
+        </w:rPr>
+        <w:t xml:space="preserve">{{ ns.section }} </w:t>
+      </w:r>
+      <w:r>
+        <w:rPr>
+          <w:b/>
+          <w:bCs/>
+          <w:lang w:val="x-none" w:eastAsia="x-none"/>
+        </w:rPr>
+        <w:t xml:space="preserve">– </w:t>
+      </w:r>
+      <w:r>
+        <w:rPr>
+          <w:b/>
+          <w:bCs/>
+          <w:lang w:eastAsia="x-none"/>
+        </w:rPr>
+        <w:t>ACESSÓRIOS</w:t>
+      </w:r>
+      <w:bookmarkEnd w:id="47"/>
+    </w:p>
+    <w:p>
+      <w:pPr>
+        <w:ind w:firstLine="0"/>
+        <w:rPr>
+          <w:lang w:val="en-US" w:eastAsia="x-none"/>
+        </w:rPr>
+      </w:pPr>
+      <w:r>
+        <w:rPr>
+          <w:lang w:val="en-US" w:eastAsia="x-none"/>
+        </w:rPr>
+        <w:t xml:space="preserve">{% set ns.section = ns.section + 1 </w:t>
+      </w:r>
+      <w:r>
+        <w:rPr>
+          <w:lang w:val="en-US" w:eastAsia="x-none"/>
+        </w:rPr>
+        <w:t>-</w:t>
+      </w:r>
+      <w:r>
+        <w:rPr>
+          <w:lang w:val="en-US" w:eastAsia="x-none"/>
+        </w:rPr>
+        <w:t>%}</w:t>
+      </w:r>
+    </w:p>
+    <w:p>
+      <w:pPr>
+        <w:ind w:firstLine="0"/>
+        <w:rPr>
+          <w:lang w:eastAsia="x-none"/>
+        </w:rPr>
+      </w:pPr>
+      <w:r>
+        <w:rPr>
+          <w:lang w:eastAsia="x-none"/>
+        </w:rPr>
+        <w:t xml:space="preserve">{% if projeto.acessorios.tem_dcf </w:t>
+      </w:r>
+      <w:r>
+        <w:rPr>
+          <w:lang w:eastAsia="x-none"/>
+        </w:rPr>
+        <w:t>-</w:t>
+      </w:r>
+      <w:r>
+        <w:rPr>
+          <w:lang w:eastAsia="x-none"/>
+        </w:rPr>
+        <w:t>%}</w:t>
+      </w:r>
+    </w:p>
+    <w:p>
+      <w:pPr>
+        <w:keepNext/>
+        <w:keepLines/>
+        <w:outlineLvl w:val="1"/>
+        <w:rPr>
+          <w:b/>
+          <w:bCs/>
+          <w:lang w:eastAsia="x-none"/>
+        </w:rPr>
+      </w:pPr>
+      <w:r>
+        <w:rPr>
+          <w:b/>
+          <w:bCs/>
+          <w:lang w:eastAsia="x-none"/>
+        </w:rPr>
+        <w:t>{{ ns.section-1 }</w:t>
+      </w:r>
+      <w:r>
+        <w:rPr>
+          <w:b/>
+          <w:bCs/>
+          <w:lang w:eastAsia="x-none"/>
+        </w:rPr>
+        <w:t>}</w:t>
+      </w:r>
+      <w:r>
+        <w:rPr>
+          <w:b/>
+          <w:bCs/>
+          <w:lang w:val="x-none" w:eastAsia="x-none"/>
+        </w:rPr>
+        <w:t xml:space="preserve">.1 – </w:t>
+      </w:r>
+      <w:r>
+        <w:rPr>
+          <w:b/>
+          <w:bCs/>
+          <w:lang w:eastAsia="x-none"/>
+        </w:rPr>
+        <w:t>DAMPER CORTA-FOGO (somente se tiver)</w:t>
+      </w:r>
+    </w:p>
+    <w:p>
+      <w:pPr>
+        <w:tabs>
+          <w:tab w:val="clear" w:pos="0"/>
+          <w:tab w:val="left" w:pos="426"/>
+        </w:tabs>
+        <w:ind w:left="426" w:firstLine="0"/>
+        <w:rPr>
+          <w:lang w:eastAsia="x-none"/>
+        </w:rPr>
+      </w:pPr>
+      <w:r>
+        <w:rPr>
+          <w:lang w:eastAsia="x-none"/>
+        </w:rPr>
+        <w:t>Os dampers corta-fogo são parte integrante do sistema de proteção contra incêndio, essenciais em sistemas onde o TRRF é mandatório. Disponível nas opções 90 e 120 minutos, a ser informado pelo cliente.</w:t>
+      </w:r>
+    </w:p>
+    <w:p>
+      <w:pPr>
+        <w:ind w:firstLine="0"/>
+        <w:jc w:val="center"/>
+        <w:rPr>
+          <w:lang w:eastAsia="x-none"/>
+        </w:rPr>
+      </w:pPr>
+      <w:r>
+        <w:rPr>
+          <w:noProof/>
+          <w:lang w:eastAsia="x-none"/>
+        </w:rPr>
+        <w:lastRenderedPageBreak/>
+        <w:drawing>
+          <wp:inline distT="0" distB="0" distL="0" distR="0" wp14:anchorId="2486C0C3" wp14:editId="609DCB7C">
+            <wp:extent cx="1905000" cy="1699277"/>
+            <wp:effectExtent l="0" t="0" r="0" b="0"/>
+            <wp:docPr id="1991609786" name="Imagem 1" descr="Porta de madeira com vidro&#10;&#10;Descrição gerada automaticamente com confiança baixa"/>
+            <wp:cNvGraphicFramePr>
+              <a:graphicFrameLocks xmlns:a="http://schemas.openxmlformats.org/drawingml/2006/main" noChangeAspect="1"/>
+            </wp:cNvGraphicFramePr>
+            <a:graphic xmlns:a="http://schemas.openxmlformats.org/drawingml/2006/main">
+              <a:graphicData uri="http://schemas.openxmlformats.org/drawingml/2006/picture">
+                <pic:pic xmlns:pic="http://schemas.openxmlformats.org/drawingml/2006/picture">
+                  <pic:nvPicPr>
+                    <pic:cNvPr id="2093361430" name="Imagem 1" descr="Porta de madeira com vidro&#10;&#10;Descrição gerada automaticamente com confiança baixa"/>
+                    <pic:cNvPicPr/>
+                  </pic:nvPicPr>
+                  <pic:blipFill>
+                    <a:blip r:embed="rId20"/>
+                    <a:stretch>
+                      <a:fillRect/>
+                    </a:stretch>
+                  </pic:blipFill>
+                  <pic:spPr>
+                    <a:xfrm>
+                      <a:off x="0" y="0"/>
+                      <a:ext cx="1915509" cy="1708651"/>
+                    </a:xfrm>
+                    <a:prstGeom prst="rect">
+                      <a:avLst/>
+                    </a:prstGeom>
+                  </pic:spPr>
+                </pic:pic>
+              </a:graphicData>
+            </a:graphic>
+          </wp:inline>
+        </w:drawing>
+      </w:r>
+    </w:p>
+    <w:p>
+      <w:r>
+        <w:t>{{ '</w:t>
+      </w:r>
+      <w:r>
+        <w:rPr>
+          <w:rFonts w:ascii="Segoe UI Symbol" w:hAnsi="Segoe UI Symbol" w:cs="Segoe UI Symbol"/>
+        </w:rPr>
+        <w:t>☒</w:t>
+      </w:r>
+      <w:r>
+        <w:t>' if projeto.acessorios.tem_dcf_90 else '</w:t>
+      </w:r>
+      <w:r>
+        <w:rPr>
+          <w:rFonts w:ascii="Segoe UI Symbol" w:hAnsi="Segoe UI Symbol" w:cs="Segoe UI Symbol"/>
+        </w:rPr>
+        <w:t>☐</w:t>
+      </w:r>
+      <w:r>
+        <w:t>' }} 90 minutos</w:t>
+      </w:r>
+    </w:p>
+    <w:p>
+      <w:r>
+        <w:t>{{ '</w:t>
+      </w:r>
+      <w:r>
+        <w:rPr>
+          <w:rFonts w:ascii="Segoe UI Symbol" w:hAnsi="Segoe UI Symbol" w:cs="Segoe UI Symbol"/>
+        </w:rPr>
+        <w:t>☒</w:t>
+      </w:r>
+      <w:r>
+        <w:t>' if projeto.acessorios.tem_dcf_120 else '</w:t>
+      </w:r>
+      <w:r>
+        <w:rPr>
+          <w:rFonts w:ascii="Segoe UI Symbol" w:hAnsi="Segoe UI Symbol" w:cs="Segoe UI Symbol"/>
+        </w:rPr>
+        <w:t>☐</w:t>
+      </w:r>
+      <w:r>
+        <w:t>' }} 120 minutos</w:t>
+      </w:r>
+    </w:p>
+    <w:p>
+      <w:sdt>
+        <w:sdtPr>
+          <w:id w:val="-1567480146"/>
+          <w14:checkbox>
+            <w14:checked w14:val="1"/>
+            <w14:checkedState w14:val="2612" w14:font="MS Gothic"/>
+            <w14:uncheckedState w14:val="2610" w14:font="MS Gothic"/>
+          </w14:checkbox>
+        </w:sdtPr>
+        <w:sdtEndPr/>
+        <w:sdtContent>
+          <w:r>
+            <w:rPr>
+              <w:rFonts w:ascii="MS Gothic" w:eastAsia="MS Gothic" w:hAnsi="MS Gothic" w:hint="eastAsia"/>
+            </w:rPr>
+            <w:t>☒</w:t>
+          </w:r>
+        </w:sdtContent>
+      </w:sdt>
+      <w:r>
+        <w:t xml:space="preserve"> Solenóide para fechamento automático por pulso elétrico e rearme manual</w:t>
+      </w:r>
+    </w:p>
+    <w:p>
+      <w:sdt>
+        <w:sdtPr>
+          <w:id w:val="5561281"/>
+          <w14:checkbox>
+            <w14:checked w14:val="1"/>
+            <w14:checkedState w14:val="2612" w14:font="MS Gothic"/>
+            <w14:uncheckedState w14:val="2610" w14:font="MS Gothic"/>
+          </w14:checkbox>
+        </w:sdtPr>
+        <w:sdtEndPr/>
+        <w:sdtContent>
+          <w:r>
+            <w:rPr>
+              <w:rFonts w:ascii="MS Gothic" w:eastAsia="MS Gothic" w:hAnsi="MS Gothic" w:hint="eastAsia"/>
+            </w:rPr>
+            <w:t>☒</w:t>
+          </w:r>
+        </w:sdtContent>
+      </w:sdt>
+      <w:r>
+        <w:t xml:space="preserve"> Chave fim de curso</w:t>
+      </w:r>
+    </w:p>
+    <w:p>
+      <w:sdt>
+        <w:sdtPr>
+          <w:id w:val="-1050602724"/>
+          <w14:checkbox>
+            <w14:checked w14:val="1"/>
+            <w14:checkedState w14:val="2612" w14:font="MS Gothic"/>
+            <w14:uncheckedState w14:val="2610" w14:font="MS Gothic"/>
+          </w14:checkbox>
+        </w:sdtPr>
+        <w:sdtEndPr/>
+        <w:sdtContent>
+          <w:r>
+            <w:rPr>
+              <w:rFonts w:ascii="MS Gothic" w:eastAsia="MS Gothic" w:hAnsi="MS Gothic" w:hint="eastAsia"/>
+            </w:rPr>
+            <w:t>☒</w:t>
+          </w:r>
+        </w:sdtContent>
+      </w:sdt>
+      <w:r>
+        <w:t xml:space="preserve"> Fusível de temperatura</w:t>
+      </w:r>
+    </w:p>
+    <w:p>
+      <w:sdt>
+        <w:sdtPr>
+          <w:id w:val="1802653693"/>
+          <w14:checkbox>
+            <w14:checked w14:val="0"/>
+            <w14:checkedState w14:val="2612" w14:font="MS Gothic"/>
+            <w14:uncheckedState w14:val="2610" w14:font="MS Gothic"/>
+          </w14:checkbox>
+        </w:sdtPr>
+        <w:sdtEndPr/>
+        <w:sdtContent>
+          <w:r>
+            <w:rPr>
+              <w:rFonts w:ascii="Segoe UI Symbol" w:hAnsi="Segoe UI Symbol" w:cs="Segoe UI Symbol"/>
+            </w:rPr>
+            <w:t>☐</w:t>
+          </w:r>
+        </w:sdtContent>
+      </w:sdt>
+      <w:r>
+        <w:t xml:space="preserve"> Atuador motorizado para fechamento e abertura automática</w:t>
+      </w:r>
+    </w:p>
+    <w:p/>
+    <w:p>
+      <w:r>
+        <w:t>Legenda:</w:t>
+      </w:r>
+    </w:p>
+    <w:p>
+      <w:sdt>
+        <w:sdtPr>
+          <w:id w:val="-105513108"/>
+          <w14:checkbox>
+            <w14:checked w14:val="1"/>
+            <w14:checkedState w14:val="2612" w14:font="MS Gothic"/>
+            <w14:uncheckedState w14:val="2610" w14:font="MS Gothic"/>
+          </w14:checkbox>
+        </w:sdtPr>
+        <w:sdtEndPr/>
+        <w:sdtContent>
+          <w:r>
+            <w:rPr>
+              <w:rFonts w:ascii="Segoe UI Symbol" w:hAnsi="Segoe UI Symbol" w:cs="Segoe UI Symbol"/>
+            </w:rPr>
+            <w:t>☒</w:t>
+          </w:r>
+        </w:sdtContent>
+      </w:sdt>
+      <w:r>
+        <w:t xml:space="preserve"> Incluso</w:t>
+      </w:r>
+    </w:p>
+    <w:p>
+      <w:sdt>
+        <w:sdtPr>
+          <w:id w:val="830880381"/>
+          <w14:checkbox>
+            <w14:checked w14:val="0"/>
+            <w14:checkedState w14:val="2612" w14:font="MS Gothic"/>
+            <w14:uncheckedState w14:val="2610" w14:font="MS Gothic"/>
+          </w14:checkbox>
+        </w:sdtPr>
+        <w:sdtEndPr/>
+        <w:sdtContent>
+          <w:r>
+            <w:rPr>
+              <w:rFonts w:ascii="Segoe UI Symbol" w:hAnsi="Segoe UI Symbol" w:cs="Segoe UI Symbol"/>
+            </w:rPr>
+            <w:t>☐</w:t>
+          </w:r>
+        </w:sdtContent>
+      </w:sdt>
+      <w:r>
+        <w:t xml:space="preserve"> Não incluso</w:t>
+      </w:r>
+    </w:p>
+    <w:p/>
+    <w:p>
+      <w:pPr>
+        <w:keepNext/>
+        <w:keepLines/>
+        <w:outlineLvl w:val="1"/>
+        <w:rPr>
+          <w:b/>
+          <w:bCs/>
+          <w:lang w:val="x-none" w:eastAsia="x-none"/>
+        </w:rPr>
+      </w:pPr>
+      <w:r>
+        <w:rPr>
+          <w:b/>
+          <w:bCs/>
+          <w:lang w:eastAsia="x-none"/>
+        </w:rPr>
+        <w:t>{{ ns.section-1 }</w:t>
+      </w:r>
+      <w:r>
+        <w:rPr>
+          <w:b/>
+          <w:bCs/>
+          <w:lang w:eastAsia="x-none"/>
+        </w:rPr>
+        <w:t>}</w:t>
+      </w:r>
+      <w:r>
+        <w:rPr>
+          <w:b/>
+          <w:bCs/>
+          <w:lang w:val="x-none" w:eastAsia="x-none"/>
+        </w:rPr>
+        <w:t>.</w:t>
+      </w:r>
+      <w:r>
+        <w:rPr>
+          <w:b/>
+          <w:bCs/>
+          <w:lang w:val="x-none" w:eastAsia="x-none"/>
+        </w:rPr>
+        <w:t>2</w:t>
+      </w:r>
+      <w:r>
+        <w:rPr>
+          <w:b/>
+          <w:bCs/>
+          <w:lang w:val="x-none" w:eastAsia="x-none"/>
+        </w:rPr>
+        <w:t xml:space="preserve"> – ALIMENTAÇÃO ELÉTRICA</w:t>
+      </w:r>
+    </w:p>
+    <w:p>
+      <w:pPr>
+        <w:rPr>
+          <w:lang w:val="x-none" w:eastAsia="x-none"/>
+        </w:rPr>
+      </w:pPr>
+      <w:r>
+        <w:rPr>
+          <w:lang w:val="x-none" w:eastAsia="x-none"/>
+        </w:rPr>
+        <w:t>Alimentação de força:</w:t>
+      </w:r>
+    </w:p>
+    <w:p>
+      <w:sdt>
+        <w:sdtPr>
+          <w:id w:val="1130285619"/>
+          <w14:checkbox>
+            <w14:checked w14:val="0"/>
+            <w14:checkedState w14:val="2612" w14:font="MS Gothic"/>
+            <w14:uncheckedState w14:val="2610" w14:font="MS Gothic"/>
+          </w14:checkbox>
+        </w:sdtPr>
+        <w:sdtEndPr/>
+        <w:sdtContent>
+          <w:r>
+            <w:rPr>
+              <w:rFonts w:ascii="Segoe UI Symbol" w:hAnsi="Segoe UI Symbol" w:cs="Segoe UI Symbol"/>
+            </w:rPr>
+            <w:t>☐</w:t>
+          </w:r>
+        </w:sdtContent>
+      </w:sdt>
+      <w:r>
+        <w:t xml:space="preserve"> 220V</w:t>
+      </w:r>
+    </w:p>
+    <w:p>
+      <w:sdt>
+        <w:sdtPr>
+          <w:id w:val="1770192609"/>
+          <w14:checkbox>
+            <w14:checked w14:val="0"/>
+            <w14:checkedState w14:val="2612" w14:font="MS Gothic"/>
+            <w14:uncheckedState w14:val="2610" w14:font="MS Gothic"/>
+          </w14:checkbox>
+        </w:sdtPr>
+        <w:sdtEndPr/>
+        <w:sdtContent>
+          <w:r>
+            <w:rPr>
+              <w:rFonts w:ascii="Segoe UI Symbol" w:hAnsi="Segoe UI Symbol" w:cs="Segoe UI Symbol"/>
+            </w:rPr>
+            <w:t>☐</w:t>
+          </w:r>
+        </w:sdtContent>
+      </w:sdt>
+      <w:r>
+        <w:t xml:space="preserve"> 24V</w:t>
+      </w:r>
+    </w:p>
+    <w:p/>
+    <w:p>
+      <w:r>
+        <w:t>Legenda:</w:t>
+      </w:r>
+    </w:p>
+    <w:p>
+      <w:pPr>
+        <w:rPr>
+          <w:lang w:val="en-US"/>
+        </w:rPr>
+      </w:pPr>
+      <w:sdt>
+        <w:sdtPr>
+          <w:rPr>
+            <w:lang w:val="en-US"/>
+          </w:rPr>
+          <w:id w:val="1797170315"/>
+          <w14:checkbox>
+            <w14:checked w14:val="1"/>
+            <w14:checkedState w14:val="2612" w14:font="MS Gothic"/>
+            <w14:uncheckedState w14:val="2610" w14:font="MS Gothic"/>
+          </w14:checkbox>
+        </w:sdtPr>
+        <w:sdtEndPr/>
+        <w:sdtContent>
+          <w:r>
+            <w:rPr>
+              <w:rFonts w:ascii="Segoe UI Symbol" w:hAnsi="Segoe UI Symbol" w:cs="Segoe UI Symbol"/>
+              <w:lang w:val="en-US"/>
+            </w:rPr>
+            <w:t>☒</w:t>
+          </w:r>
+        </w:sdtContent>
+      </w:sdt>
+      <w:r>
+        <w:rPr>
+          <w:lang w:val="en-US"/>
+        </w:rPr>
+        <w:t xml:space="preserve"> Incluso</w:t>
+      </w:r>
+    </w:p>
+    <w:p>
+      <w:pPr>
+        <w:rPr>
+          <w:lang w:val="en-US"/>
+        </w:rPr>
+      </w:pPr>
+      <w:sdt>
+        <w:sdtPr>
+          <w:rPr>
+            <w:lang w:val="en-US"/>
+          </w:rPr>
+          <w:id w:val="-718894747"/>
+          <w14:checkbox>
+            <w14:checked w14:val="0"/>
+            <w14:checkedState w14:val="2612" w14:font="MS Gothic"/>
+            <w14:uncheckedState w14:val="2610" w14:font="MS Gothic"/>
+          </w14:checkbox>
+        </w:sdtPr>
+        <w:sdtEndPr/>
+        <w:sdtContent>
+          <w:r>
+            <w:rPr>
+              <w:rFonts w:ascii="Segoe UI Symbol" w:hAnsi="Segoe UI Symbol" w:cs="Segoe UI Symbol"/>
+              <w:lang w:val="en-US"/>
+            </w:rPr>
+            <w:t>☐</w:t>
+          </w:r>
+        </w:sdtContent>
+      </w:sdt>
+      <w:r>
+        <w:rPr>
+          <w:lang w:val="en-US"/>
+        </w:rPr>
+        <w:t xml:space="preserve"> Não incluso</w:t>
+      </w:r>
+    </w:p>
+    <w:p>
+      <w:pPr>
+        <w:ind w:firstLine="0"/>
+        <w:jc w:val="left"/>
+        <w:rPr>
+          <w:lang w:val="en-US" w:eastAsia="x-none"/>
+        </w:rPr>
+      </w:pPr>
+      <w:r>
+        <w:rPr>
+          <w:lang w:val="en-US" w:eastAsia="x-none"/>
+        </w:rPr>
+        <w:t xml:space="preserve">{% set ns.section = ns.section + 1 </w:t>
+      </w:r>
+      <w:r>
+        <w:rPr>
+          <w:lang w:val="en-US" w:eastAsia="x-none"/>
+        </w:rPr>
+        <w:t>-</w:t>
+      </w:r>
+      <w:r>
+        <w:rPr>
+          <w:lang w:val="en-US" w:eastAsia="x-none"/>
+        </w:rPr>
+        <w:t>%}</w:t>
+      </w:r>
+    </w:p>
+    <w:p>
+      <w:pPr>
+        <w:ind w:firstLine="0"/>
+        <w:jc w:val="left"/>
+        <w:rPr>
+          <w:lang w:eastAsia="x-none"/>
+        </w:rPr>
+      </w:pPr>
+      <w:r>
+        <w:rPr>
+          <w:lang w:eastAsia="x-none"/>
+        </w:rPr>
+        <w:t xml:space="preserve">{% endif </w:t>
+      </w:r>
+      <w:r>
+        <w:rPr>
+          <w:lang w:eastAsia="x-none"/>
+        </w:rPr>
+        <w:t>-</w:t>
+      </w:r>
+      <w:r>
+        <w:rPr>
+          <w:lang w:eastAsia="x-none"/>
+        </w:rPr>
+        <w:t>%}</w:t>
+      </w:r>
+    </w:p>
+    <w:p>
+      <w:pPr>
+        <w:ind w:firstLine="0"/>
+        <w:rPr>
+          <w:lang w:eastAsia="x-none"/>
+        </w:rPr>
+      </w:pPr>
+      <w:r>
+        <w:rPr>
+          <w:lang w:eastAsia="x-none"/>
+        </w:rPr>
+        <w:t>{% if projeto.acessorios.tem_tae %}</w:t>
+      </w:r>
+    </w:p>
+    <w:p>
+      <w:pPr>
+        <w:keepNext/>
+        <w:keepLines/>
+        <w:outlineLvl w:val="1"/>
+        <w:rPr>
+          <w:b/>
+          <w:bCs/>
+          <w:lang w:eastAsia="x-none"/>
+        </w:rPr>
+      </w:pPr>
+      <w:bookmarkStart w:id="48" w:name="_Toc527033864"/>
+      <w:r>
+        <w:rPr>
+          <w:b/>
+          <w:bCs/>
+          <w:lang w:eastAsia="x-none"/>
+        </w:rPr>
+        <w:t>{{ ns.section-1 }}</w:t>
+      </w:r>
+      <w:r>
+        <w:rPr>
+          <w:b/>
+          <w:bCs/>
+          <w:lang w:val="x-none" w:eastAsia="x-none"/>
+        </w:rPr>
+        <w:t xml:space="preserve">.1 – </w:t>
+      </w:r>
+      <w:r>
+        <w:rPr>
+          <w:b/>
+          <w:bCs/>
+          <w:lang w:eastAsia="x-none"/>
+        </w:rPr>
+        <w:t>TOMADA DE AR EXTERNO</w:t>
+      </w:r>
+      <w:bookmarkEnd w:id="48"/>
+      <w:r>
+        <w:rPr>
+          <w:b/>
+          <w:bCs/>
+          <w:lang w:eastAsia="x-none"/>
+        </w:rPr>
+        <w:t xml:space="preserve"> </w:t>
+      </w:r>
+    </w:p>
+    <w:p>
+      <w:pPr>
+        <w:tabs>
+          <w:tab w:val="clear" w:pos="0"/>
+          <w:tab w:val="left" w:pos="426"/>
+        </w:tabs>
+        <w:ind w:left="426" w:firstLine="0"/>
+        <w:rPr>
+          <w:lang w:eastAsia="x-none"/>
+        </w:rPr>
+      </w:pPr>
+      <w:r>
+        <w:rPr>
+          <w:lang w:eastAsia="x-none"/>
+        </w:rPr>
+        <w:t xml:space="preserve">O conjunto de tomada de ar externo é composto por veneziana externa para proteção, registro de vazão com láminas convergentes pintadas com esmalte sintético preto fosco e filtro de fibra sintética </w:t>
+      </w:r>
+      <w:r>
+        <w:rPr>
+          <w:lang w:eastAsia="x-none"/>
+        </w:rPr>
+        <w:lastRenderedPageBreak/>
+        <w:t>descartável G4. Sua função é garantir a entrada de ar filtrado nas salas. Os acessórios são fabricados em alumínio extrudado, anodizado na cor natural e com tela de proteção em plástico.</w:t>
+      </w:r>
+    </w:p>
+    <w:p>
+      <w:pPr>
+        <w:ind w:firstLine="0"/>
+        <w:jc w:val="center"/>
+        <w:rPr>
+          <w:lang w:eastAsia="x-none"/>
+        </w:rPr>
+      </w:pPr>
+      <w:r>
+        <w:rPr>
+          <w:noProof/>
+          <w:lang w:eastAsia="x-none"/>
+        </w:rPr>
+        <w:drawing>
+          <wp:inline distT="0" distB="0" distL="0" distR="0" wp14:anchorId="20943B4D" wp14:editId="71B3B7FC">
+            <wp:extent cx="1973580" cy="1265675"/>
+            <wp:effectExtent l="0" t="0" r="7620" b="0"/>
+            <wp:docPr id="1485353427" name="Imagem 1485353427"/>
+            <wp:cNvGraphicFramePr>
+              <a:graphicFrameLocks xmlns:a="http://schemas.openxmlformats.org/drawingml/2006/main" noChangeAspect="1"/>
+            </wp:cNvGraphicFramePr>
+            <a:graphic xmlns:a="http://schemas.openxmlformats.org/drawingml/2006/main">
+              <a:graphicData uri="http://schemas.openxmlformats.org/drawingml/2006/picture">
+                <pic:pic xmlns:pic="http://schemas.openxmlformats.org/drawingml/2006/picture">
+                  <pic:nvPicPr>
+                    <pic:cNvPr id="0" name="Picture 13"/>
+                    <pic:cNvPicPr>
+                      <a:picLocks noChangeAspect="1" noChangeArrowheads="1"/>
+                    </pic:cNvPicPr>
+                  </pic:nvPicPr>
+                  <pic:blipFill>
+                    <a:blip r:embed="rId21" cstate="print">
+                      <a:extLst>
+                        <a:ext uri="{28A0092B-C50C-407E-A947-70E740481C1C}">
+                          <a14:useLocalDpi xmlns:a14="http://schemas.microsoft.com/office/drawing/2010/main" val="0"/>
+                        </a:ext>
+                      </a:extLst>
+                    </a:blip>
+                    <a:srcRect/>
+                    <a:stretch>
+                      <a:fillRect/>
+                    </a:stretch>
+                  </pic:blipFill>
+                  <pic:spPr bwMode="auto">
+                    <a:xfrm>
+                      <a:off x="0" y="0"/>
+                      <a:ext cx="1977320" cy="1268073"/>
+                    </a:xfrm>
+                    <a:prstGeom prst="rect">
+                      <a:avLst/>
+                    </a:prstGeom>
+                    <a:noFill/>
+                    <a:ln>
+                      <a:noFill/>
+                    </a:ln>
+                  </pic:spPr>
+                </pic:pic>
+              </a:graphicData>
+            </a:graphic>
+          </wp:inline>
+        </w:drawing>
+      </w:r>
+    </w:p>
+    <w:p>
+      <w:pPr>
+        <w:ind w:firstLine="0"/>
+        <w:jc w:val="left"/>
+        <w:rPr>
+          <w:lang w:val="en-US" w:eastAsia="x-none"/>
+        </w:rPr>
+      </w:pPr>
+      <w:r>
+        <w:rPr>
+          <w:lang w:val="en-US" w:eastAsia="x-none"/>
+        </w:rPr>
+        <w:t xml:space="preserve">{% set ns.section = ns.section + 1 </w:t>
+      </w:r>
+      <w:r>
+        <w:rPr>
+          <w:lang w:val="en-US" w:eastAsia="x-none"/>
+        </w:rPr>
+        <w:t>-</w:t>
+      </w:r>
+      <w:r>
+        <w:rPr>
+          <w:lang w:val="en-US" w:eastAsia="x-none"/>
+        </w:rPr>
+        <w:t>%}</w:t>
+      </w:r>
+    </w:p>
+    <w:p>
+      <w:pPr>
+        <w:ind w:firstLine="0"/>
+        <w:jc w:val="left"/>
+        <w:rPr>
+          <w:lang w:eastAsia="x-none"/>
+        </w:rPr>
+      </w:pPr>
+      <w:r>
+        <w:rPr>
+          <w:lang w:eastAsia="x-none"/>
+        </w:rPr>
+        <w:t xml:space="preserve">{% endif </w:t>
+      </w:r>
+      <w:r>
+        <w:rPr>
+          <w:lang w:eastAsia="x-none"/>
+        </w:rPr>
+        <w:t>-</w:t>
+      </w:r>
+      <w:r>
+        <w:rPr>
+          <w:lang w:eastAsia="x-none"/>
+        </w:rPr>
+        <w:t>%}</w:t>
+      </w:r>
+    </w:p>
+    <w:p>
+      <w:pPr>
+        <w:ind w:firstLine="0"/>
+        <w:jc w:val="left"/>
+        <w:rPr>
+          <w:lang w:eastAsia="x-none"/>
+        </w:rPr>
+      </w:pPr>
+      <w:r>
+        <w:rPr>
+          <w:lang w:eastAsia="x-none"/>
+        </w:rPr>
+        <w:t>{% if projeto.acessorios.tem_vz %}</w:t>
+      </w:r>
+    </w:p>
+    <w:p>
+      <w:pPr>
+        <w:keepNext/>
+        <w:keepLines/>
+        <w:outlineLvl w:val="1"/>
+        <w:rPr>
+          <w:b/>
+          <w:bCs/>
+          <w:lang w:eastAsia="x-none"/>
+        </w:rPr>
+      </w:pPr>
+      <w:r>
+        <w:rPr>
+          <w:b/>
+          <w:bCs/>
+          <w:lang w:eastAsia="x-none"/>
+        </w:rPr>
+        <w:t>{{ ns.section-1 }}</w:t>
+      </w:r>
+      <w:r>
+        <w:rPr>
+          <w:b/>
+          <w:bCs/>
+          <w:lang w:eastAsia="x-none"/>
+        </w:rPr>
+        <w:t>.</w:t>
+      </w:r>
+      <w:r>
+        <w:rPr>
+          <w:b/>
+          <w:bCs/>
+          <w:lang w:eastAsia="x-none"/>
+        </w:rPr>
+        <w:t>1</w:t>
+      </w:r>
+      <w:r>
+        <w:rPr>
+          <w:b/>
+          <w:bCs/>
+          <w:lang w:eastAsia="x-none"/>
+        </w:rPr>
+        <w:t xml:space="preserve"> – VENEZIANA EXTERNA DE PROTEÇÃO</w:t>
+      </w:r>
+    </w:p>
+    <w:p>
+      <w:pPr>
+        <w:tabs>
+          <w:tab w:val="clear" w:pos="0"/>
+          <w:tab w:val="left" w:pos="426"/>
+        </w:tabs>
+        <w:ind w:left="426" w:firstLine="0"/>
+        <w:rPr>
+          <w:lang w:eastAsia="x-none"/>
+        </w:rPr>
+      </w:pPr>
+      <w:r>
+        <w:rPr>
+          <w:lang w:eastAsia="x-none"/>
+        </w:rPr>
+        <w:t>O conjunto de tomada de ar externo é composto por veneziana externa para proteção, registro de vazão com láminas convergentes pintadas com esmalte sintético preto fosco e filtro de fibra sintética descartável G4. Sua função é garantir a entrada de ar filtrado nas salas. Os acessórios são fabricados em alumínio extrudado, anodizado na cor natural e com tela de proteção em plástico.</w:t>
+      </w:r>
+    </w:p>
+    <w:p>
+      <w:pPr>
+        <w:jc w:val="center"/>
+        <w:rPr>
+          <w:lang w:eastAsia="x-none"/>
+        </w:rPr>
+      </w:pPr>
+      <w:r>
+        <w:rPr>
+          <w:noProof/>
+          <w:lang w:eastAsia="x-none"/>
+        </w:rPr>
+        <w:drawing>
+          <wp:inline distT="0" distB="0" distL="0" distR="0" wp14:anchorId="16A63589" wp14:editId="01608D55">
+            <wp:extent cx="1973580" cy="1265675"/>
+            <wp:effectExtent l="0" t="0" r="7620" b="0"/>
+            <wp:docPr id="1724066962" name="Imagem 1724066962"/>
+            <wp:cNvGraphicFramePr>
+              <a:graphicFrameLocks xmlns:a="http://schemas.openxmlformats.org/drawingml/2006/main" noChangeAspect="1"/>
+            </wp:cNvGraphicFramePr>
+            <a:graphic xmlns:a="http://schemas.openxmlformats.org/drawingml/2006/main">
+              <a:graphicData uri="http://schemas.openxmlformats.org/drawingml/2006/picture">
+                <pic:pic xmlns:pic="http://schemas.openxmlformats.org/drawingml/2006/picture">
+                  <pic:nvPicPr>
+                    <pic:cNvPr id="0" name="Picture 13"/>
+                    <pic:cNvPicPr>
+                      <a:picLocks noChangeAspect="1" noChangeArrowheads="1"/>
+                    </pic:cNvPicPr>
+                  </pic:nvPicPr>
+                  <pic:blipFill>
+                    <a:blip r:embed="rId21" cstate="print">
+                      <a:extLst>
+                        <a:ext uri="{28A0092B-C50C-407E-A947-70E740481C1C}">
+                          <a14:useLocalDpi xmlns:a14="http://schemas.microsoft.com/office/drawing/2010/main" val="0"/>
+                        </a:ext>
+                      </a:extLst>
+                    </a:blip>
+                    <a:srcRect/>
+                    <a:stretch>
+                      <a:fillRect/>
+                    </a:stretch>
+                  </pic:blipFill>
+                  <pic:spPr bwMode="auto">
+                    <a:xfrm>
+                      <a:off x="0" y="0"/>
+                      <a:ext cx="1977320" cy="1268073"/>
+                    </a:xfrm>
+                    <a:prstGeom prst="rect">
+                      <a:avLst/>
+                    </a:prstGeom>
+                    <a:noFill/>
+                    <a:ln>
+                      <a:noFill/>
+                    </a:ln>
+                  </pic:spPr>
+                </pic:pic>
+              </a:graphicData>
+            </a:graphic>
+          </wp:inline>
+        </w:drawing>
+      </w:r>
+    </w:p>
+    <w:p>
+      <w:pPr>
+        <w:jc w:val="left"/>
+        <w:rPr>
+          <w:lang w:val="en-US" w:eastAsia="x-none"/>
+        </w:rPr>
+      </w:pPr>
+      <w:r>
+        <w:rPr>
+          <w:lang w:val="en-US" w:eastAsia="x-none"/>
+        </w:rPr>
+        <w:t xml:space="preserve">{% set ns.section = ns.section + 1 </w:t>
+      </w:r>
+      <w:r>
+        <w:rPr>
+          <w:lang w:val="en-US" w:eastAsia="x-none"/>
+        </w:rPr>
+        <w:t>-</w:t>
+      </w:r>
+      <w:r>
+        <w:rPr>
+          <w:lang w:val="en-US" w:eastAsia="x-none"/>
+        </w:rPr>
+        <w:t>%}</w:t>
+      </w:r>
+    </w:p>
+    <w:p>
+      <w:pPr>
+        <w:jc w:val="left"/>
+        <w:rPr>
+          <w:lang w:eastAsia="x-none"/>
+        </w:rPr>
+      </w:pPr>
+      <w:r>
+        <w:rPr>
+          <w:lang w:eastAsia="x-none"/>
+        </w:rPr>
+        <w:t xml:space="preserve">{% endif </w:t>
+      </w:r>
+      <w:r>
+        <w:rPr>
+          <w:lang w:eastAsia="x-none"/>
+        </w:rPr>
+        <w:t>-</w:t>
+      </w:r>
+      <w:r>
+        <w:rPr>
+          <w:lang w:eastAsia="x-none"/>
+        </w:rPr>
+        <w:t>%}</w:t>
+      </w:r>
+    </w:p>
+    <w:p>
+      <w:pPr>
+        <w:jc w:val="left"/>
+        <w:rPr>
+          <w:lang w:eastAsia="x-none"/>
+        </w:rPr>
+      </w:pPr>
+      <w:r>
+        <w:rPr>
+          <w:lang w:eastAsia="x-none"/>
+        </w:rPr>
+        <w:t xml:space="preserve">{% endif </w:t>
+      </w:r>
+      <w:r>
+        <w:rPr>
+          <w:lang w:eastAsia="x-none"/>
+        </w:rPr>
+        <w:t>-</w:t>
+      </w:r>
+      <w:r>
+        <w:rPr>
+          <w:lang w:eastAsia="x-none"/>
+        </w:rPr>
+        <w:t>%}</w:t>
+      </w:r>
+    </w:p>
+    <w:p>
+      <w:pPr>
+        <w:rPr>
+          <w:color w:val="auto"/>
+        </w:rPr>
+      </w:pPr>
+      <w:r>
+        <w:rPr>
+          <w:color w:val="auto"/>
+        </w:rPr>
+        <w:t>{% endfor %}</w:t>
+      </w:r>
+    </w:p>
+    <w:p>
+      <w:pPr>
+        <w:keepNext/>
+        <w:keepLines/>
+        <w:shd w:val="clear" w:color="auto" w:fill="F2F2F2"/>
+        <w:ind w:firstLine="0"/>
+        <w:outlineLvl w:val="0"/>
+        <w:rPr>
+          <w:b/>
+          <w:bCs/>
+          <w:lang w:eastAsia="x-none"/>
+        </w:rPr>
+      </w:pPr>
+      <w:bookmarkStart w:id="49" w:name="_Toc95916073"/>
+      <w:r>
+        <w:rPr>
+          <w:b/>
+          <w:bCs/>
+          <w:lang w:eastAsia="x-none"/>
+        </w:rPr>
+        <w:t>{{ ns.section }}</w:t>
+      </w:r>
+      <w:r>
+        <w:rPr>
+          <w:b/>
+          <w:bCs/>
+          <w:lang w:val="x-none" w:eastAsia="x-none"/>
+        </w:rPr>
+        <w:t xml:space="preserve">– </w:t>
+      </w:r>
+      <w:r>
+        <w:rPr>
+          <w:b/>
+          <w:bCs/>
+          <w:lang w:eastAsia="x-none"/>
+        </w:rPr>
+        <w:t>DOCUMENTAÇÃO DE PROJETO</w:t>
+      </w:r>
+      <w:bookmarkEnd w:id="49"/>
+      <w:r>
+        <w:rPr>
+          <w:b/>
+          <w:bCs/>
+          <w:lang w:eastAsia="x-none"/>
+        </w:rPr>
+        <w:t xml:space="preserve"> </w:t>
+      </w:r>
+    </w:p>
+    <w:p>
+      <w:pPr>
+        <w:rPr>
+          <w:lang w:val="en-US" w:eastAsia="x-none"/>
+        </w:rPr>
+      </w:pPr>
+      <w:r>
+        <w:rPr>
+          <w:lang w:val="en-US" w:eastAsia="x-none"/>
+        </w:rPr>
+        <w:t>{% set ns.section = ns.section + 1 %}</w:t>
+      </w:r>
+    </w:p>
+    <w:p>
+      <w:pPr>
+        <w:keepNext/>
+        <w:keepLines/>
+        <w:outlineLvl w:val="1"/>
+        <w:rPr>
+          <w:b/>
+          <w:bCs/>
+          <w:lang w:eastAsia="x-none"/>
+        </w:rPr>
+      </w:pPr>
+      <w:bookmarkStart w:id="50" w:name="_Toc95916074"/>
+      <w:r>
+        <w:rPr>
+          <w:b/>
+          <w:bCs/>
+          <w:lang w:eastAsia="x-none"/>
+        </w:rPr>
+        <w:t>{{ ns.section-1 }</w:t>
+      </w:r>
+      <w:r>
+        <w:rPr>
+          <w:b/>
+          <w:bCs/>
+          <w:lang w:eastAsia="x-none"/>
+        </w:rPr>
+        <w:t>}</w:t>
+      </w:r>
+      <w:r>
+        <w:rPr>
+          <w:b/>
+          <w:bCs/>
+          <w:lang w:val="x-none" w:eastAsia="x-none"/>
+        </w:rPr>
+        <w:t>.</w:t>
+      </w:r>
+      <w:r>
+        <w:rPr>
+          <w:b/>
+          <w:bCs/>
+          <w:lang w:eastAsia="x-none"/>
+        </w:rPr>
+        <w:t>1</w:t>
+      </w:r>
+      <w:r>
+        <w:rPr>
+          <w:b/>
+          <w:bCs/>
+          <w:lang w:val="x-none" w:eastAsia="x-none"/>
+        </w:rPr>
+        <w:t xml:space="preserve"> – </w:t>
+      </w:r>
+      <w:r>
+        <w:rPr>
+          <w:b/>
+          <w:bCs/>
+          <w:lang w:eastAsia="x-none"/>
+        </w:rPr>
+        <w:t>DESENHO .DWG</w:t>
+      </w:r>
+      <w:bookmarkEnd w:id="50"/>
+    </w:p>
+    <w:p>
+      <w:pPr>
+        <w:tabs>
+          <w:tab w:val="clear" w:pos="0"/>
+          <w:tab w:val="left" w:pos="567"/>
+        </w:tabs>
+        <w:ind w:left="426" w:firstLine="0"/>
+        <w:rPr>
+          <w:lang w:eastAsia="x-none"/>
+        </w:rPr>
+      </w:pPr>
+      <w:r>
+        <w:rPr>
+          <w:lang w:eastAsia="x-none"/>
+        </w:rPr>
+        <w:t>O projeto será registrado em desenho CAD, formato .DWG, de maneira a ilustrar as posições de cada equipamento, acessórios, dutos, tubulações e suas respectivas dimensões. O projeto comtemplará também as informações pertinentes de projeto, tais como capacidades, vazões, velocidades, graus de filtragem, bitolas de tubulação e chapas, limitações e distâncias mínimas requeridas, entre outras informações essenciais para correto funcionamento do sistema como um todo.</w:t>
+      </w:r>
+    </w:p>
+    <w:p>
+      <w:pPr>
+        <w:rPr>
+          <w:lang w:eastAsia="x-none"/>
+        </w:rPr>
+      </w:pPr>
+    </w:p>
+    <w:p>
+      <w:pPr>
+        <w:keepNext/>
+        <w:keepLines/>
+        <w:outlineLvl w:val="1"/>
+        <w:rPr>
+          <w:b/>
+          <w:bCs/>
+          <w:lang w:eastAsia="x-none"/>
+        </w:rPr>
+      </w:pPr>
+      <w:bookmarkStart w:id="51" w:name="_Toc95916075"/>
+      <w:r>
+        <w:rPr>
+          <w:b/>
+          <w:bCs/>
+          <w:lang w:eastAsia="x-none"/>
+        </w:rPr>
+        <w:t>{{ ns.section-1 }</w:t>
+      </w:r>
+      <w:r>
+        <w:rPr>
+          <w:b/>
+          <w:bCs/>
+          <w:lang w:eastAsia="x-none"/>
+        </w:rPr>
+        <w:t>}</w:t>
+      </w:r>
+      <w:r>
+        <w:rPr>
+          <w:b/>
+          <w:bCs/>
+          <w:lang w:val="x-none" w:eastAsia="x-none"/>
+        </w:rPr>
+        <w:t>.</w:t>
+      </w:r>
+      <w:r>
+        <w:rPr>
+          <w:b/>
+          <w:bCs/>
+          <w:lang w:eastAsia="x-none"/>
+        </w:rPr>
+        <w:t>2</w:t>
+      </w:r>
+      <w:r>
+        <w:rPr>
+          <w:b/>
+          <w:bCs/>
+          <w:lang w:val="x-none" w:eastAsia="x-none"/>
+        </w:rPr>
+        <w:t xml:space="preserve"> – </w:t>
+      </w:r>
+      <w:r>
+        <w:rPr>
+          <w:b/>
+          <w:bCs/>
+          <w:lang w:eastAsia="x-none"/>
+        </w:rPr>
+        <w:t>MEMORIAL DESCRITIVO</w:t>
+      </w:r>
+      <w:bookmarkEnd w:id="51"/>
+    </w:p>
+    <w:p>
+      <w:pPr>
+        <w:tabs>
+          <w:tab w:val="clear" w:pos="0"/>
+          <w:tab w:val="left" w:pos="426"/>
+        </w:tabs>
+        <w:ind w:left="426" w:firstLine="0"/>
+        <w:rPr>
+          <w:lang w:eastAsia="x-none"/>
+        </w:rPr>
+      </w:pPr>
+      <w:r>
+        <w:rPr>
+          <w:lang w:eastAsia="x-none"/>
+        </w:rPr>
+        <w:t>O memorial descritivo é o documento essencial para complementação dos desenhos CAD, de forma a esclarecer as considerações, resultados e seleções adotadas, bem como estabelecer boas práticas, restrições de instalação e procedimentos necessários para o bom funcionamento do sistema.</w:t>
+      </w:r>
+    </w:p>
+    <w:p>
+      <w:pPr>
+        <w:rPr>
+          <w:lang w:eastAsia="x-none"/>
+        </w:rPr>
+      </w:pPr>
+    </w:p>
+    <w:p>
+      <w:pPr>
+        <w:keepNext/>
+        <w:keepLines/>
+        <w:shd w:val="clear" w:color="auto" w:fill="F2F2F2"/>
+        <w:ind w:firstLine="0"/>
+        <w:outlineLvl w:val="0"/>
+        <w:rPr>
+          <w:b/>
+          <w:bCs/>
+          <w:lang w:eastAsia="x-none"/>
+        </w:rPr>
+      </w:pPr>
+      <w:r>
+        <w:rPr>
+          <w:b/>
+          <w:bCs/>
+          <w:lang w:eastAsia="x-none"/>
+        </w:rPr>
+        <w:t>{</w:t>
+      </w:r>
+      <w:r>
+        <w:rPr>
+          <w:b/>
+          <w:bCs/>
+          <w:lang w:eastAsia="x-none"/>
+        </w:rPr>
+        <w:t>{ ns.section }}</w:t>
+      </w:r>
+      <w:r>
+        <w:rPr>
+          <w:b/>
+          <w:bCs/>
+          <w:lang w:eastAsia="x-none"/>
+        </w:rPr>
+        <w:t xml:space="preserve"> </w:t>
+      </w:r>
+      <w:r>
+        <w:rPr>
+          <w:b/>
+          <w:bCs/>
+          <w:lang w:val="x-none" w:eastAsia="x-none"/>
+        </w:rPr>
+        <w:t xml:space="preserve">– </w:t>
+      </w:r>
+      <w:r>
+        <w:rPr>
+          <w:b/>
+          <w:bCs/>
+          <w:lang w:eastAsia="x-none"/>
+        </w:rPr>
+        <w:t xml:space="preserve">INFORMAÇÕES ADICIONAIS </w:t>
+      </w:r>
+    </w:p>
+    <w:p>
+      <w:pPr>
+        <w:rPr>
+          <w:lang w:val="en-US" w:eastAsia="x-none"/>
+        </w:rPr>
+      </w:pPr>
+      <w:r>
+        <w:rPr>
+          <w:lang w:val="en-US" w:eastAsia="x-none"/>
+        </w:rPr>
+        <w:t>{% set ns.section = ns.section + 1 %}</w:t>
+      </w:r>
+    </w:p>
+    <w:p>
+      <w:pPr>
+        <w:keepNext/>
+        <w:keepLines/>
+        <w:outlineLvl w:val="1"/>
+        <w:rPr>
+          <w:b/>
+          <w:bCs/>
+          <w:lang w:eastAsia="x-none"/>
+        </w:rPr>
+      </w:pPr>
+      <w:r>
+        <w:rPr>
+          <w:b/>
+          <w:bCs/>
+          <w:lang w:eastAsia="x-none"/>
+        </w:rPr>
+        <w:t>{{ ns.section-1 }}</w:t>
+      </w:r>
+      <w:r>
+        <w:rPr>
+          <w:b/>
+          <w:bCs/>
+          <w:lang w:val="x-none" w:eastAsia="x-none"/>
+        </w:rPr>
+        <w:t>.</w:t>
+      </w:r>
+      <w:r>
+        <w:rPr>
+          <w:b/>
+          <w:bCs/>
+          <w:lang w:eastAsia="x-none"/>
+        </w:rPr>
+        <w:t>1</w:t>
+      </w:r>
+      <w:r>
+        <w:rPr>
+          <w:b/>
+          <w:bCs/>
+          <w:lang w:val="x-none" w:eastAsia="x-none"/>
+        </w:rPr>
+        <w:t xml:space="preserve"> – </w:t>
+      </w:r>
+      <w:r>
+        <w:rPr>
+          <w:b/>
+          <w:bCs/>
+          <w:lang w:eastAsia="x-none"/>
+        </w:rPr>
+        <w:t>COMBATE A INCÊNDIO</w:t>
+      </w:r>
+    </w:p>
+    <w:p>
+      <w:pPr>
+        <w:tabs>
+          <w:tab w:val="clear" w:pos="0"/>
+          <w:tab w:val="left" w:pos="426"/>
+        </w:tabs>
+        <w:ind w:left="426" w:firstLine="0"/>
+        <w:rPr>
+          <w:lang w:eastAsia="x-none"/>
+        </w:rPr>
+      </w:pPr>
+      <w:r>
+        <w:rPr>
+          <w:lang w:eastAsia="x-none"/>
+        </w:rPr>
+        <w:t>O sistema de combate a incêndio influencia diretamente na solução HVAC. Em caso de sistemas de combate por inundação de gás, gentileza informar para adequação.</w:t>
+      </w:r>
+    </w:p>
+    <w:p>
+      <w:pPr>
+        <w:tabs>
+          <w:tab w:val="clear" w:pos="0"/>
+          <w:tab w:val="left" w:pos="426"/>
+        </w:tabs>
+        <w:ind w:left="426" w:firstLine="0"/>
+        <w:rPr>
+          <w:lang w:eastAsia="x-none"/>
+        </w:rPr>
+      </w:pPr>
+      <w:r>
+        <w:rPr>
+          <w:lang w:eastAsia="x-none"/>
+        </w:rPr>
+        <w:t>Em caso de sistemas de combate por névoa onde é requisitado sistema de exaustão de particulado após combate, gentileza informar para adequação.</w:t>
+      </w:r>
+    </w:p>
+    <w:p>
+      <w:pPr>
+        <w:tabs>
+          <w:tab w:val="clear" w:pos="0"/>
+          <w:tab w:val="left" w:pos="426"/>
+        </w:tabs>
+        <w:ind w:left="426" w:firstLine="0"/>
+        <w:rPr>
+          <w:lang w:eastAsia="x-none"/>
+        </w:rPr>
+      </w:pPr>
+      <w:r>
+        <w:rPr>
+          <w:lang w:eastAsia="x-none"/>
+        </w:rPr>
+        <w:t>Em caso de sistemas de combate com cilindros dedicados por ambiente, gentileza informar para adequação (o sistema de combate individualizado por área onera o sistema HVAC nos casos em que há duto de climatização).</w:t>
+      </w:r>
+    </w:p>
+    <w:p>
+      <w:pPr>
+        <w:rPr>
+          <w:lang w:eastAsia="x-none"/>
+        </w:rPr>
+      </w:pPr>
+    </w:p>
+    <w:p>
+      <w:pPr>
+        <w:keepNext/>
+        <w:keepLines/>
+        <w:outlineLvl w:val="1"/>
+        <w:rPr>
+          <w:b/>
+          <w:bCs/>
+          <w:lang w:eastAsia="x-none"/>
+        </w:rPr>
+      </w:pPr>
+      <w:r>
+        <w:rPr>
+          <w:b/>
+          <w:bCs/>
+          <w:lang w:eastAsia="x-none"/>
+        </w:rPr>
+        <w:t>{{ ns.section-1 }}</w:t>
+      </w:r>
+      <w:r>
+        <w:rPr>
+          <w:b/>
+          <w:bCs/>
+          <w:lang w:val="x-none" w:eastAsia="x-none"/>
+        </w:rPr>
+        <w:t>.</w:t>
+      </w:r>
+      <w:r>
+        <w:rPr>
+          <w:b/>
+          <w:bCs/>
+          <w:lang w:eastAsia="x-none"/>
+        </w:rPr>
+        <w:t>2</w:t>
+      </w:r>
+      <w:r>
+        <w:rPr>
+          <w:b/>
+          <w:bCs/>
+          <w:lang w:val="x-none" w:eastAsia="x-none"/>
+        </w:rPr>
+        <w:t xml:space="preserve"> – </w:t>
+      </w:r>
+      <w:r>
+        <w:rPr>
+          <w:b/>
+          <w:bCs/>
+          <w:lang w:eastAsia="x-none"/>
+        </w:rPr>
+        <w:t>RESISTÊNCIA A FOGO (TRRF)</w:t>
+      </w:r>
+    </w:p>
+    <w:p>
+      <w:pPr>
+        <w:tabs>
+          <w:tab w:val="clear" w:pos="0"/>
+          <w:tab w:val="left" w:pos="426"/>
+        </w:tabs>
+        <w:ind w:left="426" w:firstLine="0"/>
+        <w:rPr>
+          <w:lang w:eastAsia="x-none"/>
+        </w:rPr>
+      </w:pPr>
+      <w:r>
+        <w:rPr>
+          <w:lang w:eastAsia="x-none"/>
+        </w:rPr>
+        <w:t>Em salas com resistência a fogo, deve-se considerar uso de dampers adequados no sistema HVAC. Se aplicável, informar o Tempo Requerido para Resistencia a Fogo (TRRF) para adequação.</w:t>
+      </w:r>
+    </w:p>
+    <w:p>
+      <w:pPr>
+        <w:rPr>
+          <w:lang w:eastAsia="x-none"/>
+        </w:rPr>
+      </w:pPr>
+    </w:p>
+    <w:p>
+      <w:pPr>
+        <w:keepNext/>
+        <w:keepLines/>
+        <w:outlineLvl w:val="1"/>
+        <w:rPr>
+          <w:b/>
+          <w:bCs/>
+          <w:lang w:eastAsia="x-none"/>
+        </w:rPr>
+      </w:pPr>
+      <w:r>
+        <w:rPr>
+          <w:b/>
+          <w:bCs/>
+          <w:lang w:eastAsia="x-none"/>
+        </w:rPr>
+        <w:t>{{ ns.section-1 }}</w:t>
+      </w:r>
+      <w:r>
+        <w:rPr>
+          <w:b/>
+          <w:bCs/>
+          <w:lang w:val="x-none" w:eastAsia="x-none"/>
+        </w:rPr>
+        <w:t>.</w:t>
+      </w:r>
+      <w:r>
+        <w:rPr>
+          <w:b/>
+          <w:bCs/>
+          <w:lang w:eastAsia="x-none"/>
+        </w:rPr>
+        <w:t>3</w:t>
+      </w:r>
+      <w:r>
+        <w:rPr>
+          <w:b/>
+          <w:bCs/>
+          <w:lang w:val="x-none" w:eastAsia="x-none"/>
+        </w:rPr>
+        <w:t xml:space="preserve"> – DISSIPAÇÕES TÉRMICAS PROVENIENTES DE PAINÉIS</w:t>
+      </w:r>
+    </w:p>
+    <w:p>
+      <w:pPr>
+        <w:tabs>
+          <w:tab w:val="clear" w:pos="0"/>
+          <w:tab w:val="left" w:pos="426"/>
+        </w:tabs>
+        <w:ind w:left="426" w:firstLine="0"/>
+        <w:rPr>
+          <w:lang w:eastAsia="x-none"/>
+        </w:rPr>
+      </w:pPr>
+      <w:r>
+        <w:rPr>
+          <w:lang w:eastAsia="x-none"/>
+        </w:rPr>
+        <w:t>As dissipações afetam diretamente o dimensionamento do sistema. Em caso de alteração, gentileza informar para adequação.</w:t>
+      </w:r>
+    </w:p>
+    <w:p>
+      <w:pPr>
+        <w:rPr>
+          <w:lang w:eastAsia="x-none"/>
+        </w:rPr>
+      </w:pPr>
+    </w:p>
+    <w:p>
+      <w:pPr>
+        <w:keepNext/>
+        <w:keepLines/>
+        <w:outlineLvl w:val="1"/>
+        <w:rPr>
+          <w:b/>
+          <w:bCs/>
+          <w:lang w:eastAsia="x-none"/>
+        </w:rPr>
+      </w:pPr>
+      <w:r>
+        <w:rPr>
+          <w:b/>
+          <w:bCs/>
+          <w:lang w:eastAsia="x-none"/>
+        </w:rPr>
+        <w:t>{{ ns.section-1 }}</w:t>
+      </w:r>
+      <w:r>
+        <w:rPr>
+          <w:b/>
+          <w:bCs/>
+          <w:lang w:val="x-none" w:eastAsia="x-none"/>
+        </w:rPr>
+        <w:t>.</w:t>
+      </w:r>
+      <w:r>
+        <w:rPr>
+          <w:b/>
+          <w:bCs/>
+          <w:lang w:eastAsia="x-none"/>
+        </w:rPr>
+        <w:t>4</w:t>
+      </w:r>
+      <w:r>
+        <w:rPr>
+          <w:b/>
+          <w:bCs/>
+          <w:lang w:val="x-none" w:eastAsia="x-none"/>
+        </w:rPr>
+        <w:t xml:space="preserve"> – PRESSURIZAÇÃO</w:t>
+      </w:r>
+    </w:p>
+    <w:p>
+      <w:pPr>
+        <w:tabs>
+          <w:tab w:val="clear" w:pos="0"/>
+          <w:tab w:val="left" w:pos="567"/>
+        </w:tabs>
+        <w:ind w:left="426" w:firstLine="0"/>
+        <w:rPr>
+          <w:lang w:eastAsia="x-none"/>
+        </w:rPr>
+      </w:pPr>
+      <w:r>
+        <w:rPr>
+          <w:lang w:eastAsia="x-none"/>
+        </w:rPr>
+        <w:t>O cálculo de dissipação depende do número de portas existentes. Em caso de alteração na quantidade, modelo ou dimensão das portas, gentileza informar para adequação.</w:t>
       </w:r>
     </w:p>
     <w:sectPr>
-      <w:headerReference w:type="default" r:id="rId20"/>
-      <w:footerReference w:type="even" r:id="rId21"/>
-      <w:footerReference w:type="default" r:id="rId22"/>
-      <w:headerReference w:type="first" r:id="rId23"/>
-      <w:footerReference w:type="first" r:id="rId24"/>
+      <w:headerReference w:type="default" r:id="rId22"/>
+      <w:footerReference w:type="even" r:id="rId23"/>
+      <w:footerReference w:type="default" r:id="rId24"/>
+      <w:headerReference w:type="first" r:id="rId25"/>
+      <w:footerReference w:type="first" r:id="rId26"/>
       <w:footnotePr>
         <w:numRestart w:val="eachPage"/>
       </w:footnotePr>
@@ -20634,7 +22710,7 @@
     <w:name w:val="Normal"/>
     <w:aliases w:val="TEXTO NORMAL"/>
     <w:qFormat/>
-    <w:rsid w:val="000965BB"/>
+    <w:rsid w:val="0060457D"/>
     <w:pPr>
       <w:tabs>
         <w:tab w:val="left" w:pos="0"/>
@@ -20853,7 +22929,6 @@
   <w:style w:type="character" w:default="1" w:styleId="Fontepargpadro">
     <w:name w:val="Default Paragraph Font"/>
     <w:uiPriority w:val="1"/>
-    <w:semiHidden/>
     <w:unhideWhenUsed/>
   </w:style>
   <w:style w:type="table" w:default="1" w:styleId="Tabelanormal">

</xml_diff>